<commit_message>
Tried fixing the sound but not yet, need JS runtime
</commit_message>
<xml_diff>
--- a/YT VIDEO DOWNLOADER Documentation.docx
+++ b/YT VIDEO DOWNLOADER Documentation.docx
@@ -1,6 +1,6 @@
 
 <file path=word/document.xml><?xml version="1.0" encoding="utf-8"?>
-<w:document xmlns:wpc="http://schemas.microsoft.com/office/word/2010/wordprocessingCanvas" xmlns:cx="http://schemas.microsoft.com/office/drawing/2014/chartex" xmlns:cx1="http://schemas.microsoft.com/office/drawing/2015/9/8/chartex" xmlns:cx2="http://schemas.microsoft.com/office/drawing/2015/10/21/chartex" xmlns:cx3="http://schemas.microsoft.com/office/drawing/2016/5/9/chartex" xmlns:cx4="http://schemas.microsoft.com/office/drawing/2016/5/10/chartex" xmlns:cx5="http://schemas.microsoft.com/office/drawing/2016/5/11/chartex" xmlns:cx6="http://schemas.microsoft.com/office/drawing/2016/5/12/chartex" xmlns:cx7="http://schemas.microsoft.com/office/drawing/2016/5/13/chartex" xmlns:cx8="http://schemas.microsoft.com/office/drawing/2016/5/14/chartex" xmlns:mc="http://schemas.openxmlformats.org/markup-compatibility/2006" xmlns:aink="http://schemas.microsoft.com/office/drawing/2016/ink" xmlns:am3d="http://schemas.microsoft.com/office/drawing/2017/model3d" xmlns:o="urn:schemas-microsoft-com:office:office" xmlns:oel="http://schemas.microsoft.com/office/2019/extlst" xmlns:r="http://schemas.openxmlformats.org/officeDocument/2006/relationships" xmlns:m="http://schemas.openxmlformats.org/officeDocument/2006/math" xmlns:v="urn:schemas-microsoft-com:vml" xmlns:wp14="http://schemas.microsoft.com/office/word/2010/wordprocessingDrawing" xmlns:wp="http://schemas.openxmlformats.org/drawingml/2006/wordprocessingDrawing" xmlns:w10="urn:schemas-microsoft-com:office:word" xmlns:w="http://schemas.openxmlformats.org/wordprocessingml/2006/main" xmlns:w14="http://schemas.microsoft.com/office/word/2010/wordml" xmlns:w15="http://schemas.microsoft.com/office/word/2012/wordml" xmlns:w16cex="http://schemas.microsoft.com/office/word/2018/wordml/cex" xmlns:w16cid="http://schemas.microsoft.com/office/word/2016/wordml/cid" xmlns:w16="http://schemas.microsoft.com/office/word/2018/wordml" xmlns:w16sdtdh="http://schemas.microsoft.com/office/word/2020/wordml/sdtdatahash" xmlns:w16se="http://schemas.microsoft.com/office/word/2015/wordml/symex" xmlns:wpg="http://schemas.microsoft.com/office/word/2010/wordprocessingGroup" xmlns:wpi="http://schemas.microsoft.com/office/word/2010/wordprocessingInk" xmlns:wne="http://schemas.microsoft.com/office/word/2006/wordml" xmlns:wps="http://schemas.microsoft.com/office/word/2010/wordprocessingShape" mc:Ignorable="w14 w15 w16se w16cid w16 w16cex w16sdtdh wp14">
+<w:document xmlns:wpc="http://schemas.microsoft.com/office/word/2010/wordprocessingCanvas" xmlns:cx="http://schemas.microsoft.com/office/drawing/2014/chartex" xmlns:cx1="http://schemas.microsoft.com/office/drawing/2015/9/8/chartex" xmlns:cx2="http://schemas.microsoft.com/office/drawing/2015/10/21/chartex" xmlns:cx3="http://schemas.microsoft.com/office/drawing/2016/5/9/chartex" xmlns:cx4="http://schemas.microsoft.com/office/drawing/2016/5/10/chartex" xmlns:cx5="http://schemas.microsoft.com/office/drawing/2016/5/11/chartex" xmlns:cx6="http://schemas.microsoft.com/office/drawing/2016/5/12/chartex" xmlns:cx7="http://schemas.microsoft.com/office/drawing/2016/5/13/chartex" xmlns:cx8="http://schemas.microsoft.com/office/drawing/2016/5/14/chartex" xmlns:mc="http://schemas.openxmlformats.org/markup-compatibility/2006" xmlns:aink="http://schemas.microsoft.com/office/drawing/2016/ink" xmlns:am3d="http://schemas.microsoft.com/office/drawing/2017/model3d" xmlns:o="urn:schemas-microsoft-com:office:office" xmlns:oel="http://schemas.microsoft.com/office/2019/extlst" xmlns:r="http://schemas.openxmlformats.org/officeDocument/2006/relationships" xmlns:m="http://schemas.openxmlformats.org/officeDocument/2006/math" xmlns:v="urn:schemas-microsoft-com:vml" xmlns:wp14="http://schemas.microsoft.com/office/word/2010/wordprocessingDrawing" xmlns:wp="http://schemas.openxmlformats.org/drawingml/2006/wordprocessingDrawing" xmlns:w10="urn:schemas-microsoft-com:office:word" xmlns:w="http://schemas.openxmlformats.org/wordprocessingml/2006/main" xmlns:w14="http://schemas.microsoft.com/office/word/2010/wordml" xmlns:w15="http://schemas.microsoft.com/office/word/2012/wordml" xmlns:w16cex="http://schemas.microsoft.com/office/word/2018/wordml/cex" xmlns:w16cid="http://schemas.microsoft.com/office/word/2016/wordml/cid" xmlns:w16="http://schemas.microsoft.com/office/word/2018/wordml" xmlns:w16du="http://schemas.microsoft.com/office/word/2023/wordml/word16du" xmlns:w16sdtdh="http://schemas.microsoft.com/office/word/2020/wordml/sdtdatahash" xmlns:w16sdtfl="http://schemas.microsoft.com/office/word/2024/wordml/sdtformatlock" xmlns:w16se="http://schemas.microsoft.com/office/word/2015/wordml/symex" xmlns:wpg="http://schemas.microsoft.com/office/word/2010/wordprocessingGroup" xmlns:wpi="http://schemas.microsoft.com/office/word/2010/wordprocessingInk" xmlns:wne="http://schemas.microsoft.com/office/word/2006/wordml" xmlns:wps="http://schemas.microsoft.com/office/word/2010/wordprocessingShape" mc:Ignorable="w14 w15 w16se w16cid w16 w16cex w16sdtdh w16sdtfl w16du wp14">
   <w:body>
     <w:p>
       <w:pPr>
@@ -56,126 +56,63 @@
     </w:p>
     <w:p>
       <w:pPr>
-        <w:rPr>
-          <w:lang w:val="en-US"/>
-        </w:rPr>
-      </w:pPr>
-      <w:r>
-        <w:rPr>
-          <w:lang w:val="en-US"/>
-        </w:rPr>
-        <w:t xml:space="preserve">For this script to run you need to install the </w:t>
-      </w:r>
-      <w:proofErr w:type="spellStart"/>
-      <w:r>
-        <w:rPr>
-          <w:i/>
-          <w:iCs/>
-          <w:u w:val="single"/>
-          <w:lang w:val="en-US"/>
-        </w:rPr>
-        <w:t>yt-dlp</w:t>
-      </w:r>
-      <w:proofErr w:type="spellEnd"/>
-      <w:r>
-        <w:rPr>
-          <w:i/>
-          <w:iCs/>
-          <w:lang w:val="en-US"/>
-        </w:rPr>
-        <w:t xml:space="preserve"> </w:t>
-      </w:r>
-      <w:r>
-        <w:rPr>
-          <w:lang w:val="en-US"/>
-        </w:rPr>
-        <w:t xml:space="preserve">library since libraries like </w:t>
-      </w:r>
-      <w:proofErr w:type="spellStart"/>
-      <w:r>
-        <w:rPr>
-          <w:i/>
-          <w:iCs/>
-          <w:lang w:val="en-US"/>
-        </w:rPr>
-        <w:t>pytube</w:t>
-      </w:r>
-      <w:proofErr w:type="spellEnd"/>
-      <w:r>
-        <w:rPr>
-          <w:lang w:val="en-US"/>
-        </w:rPr>
-        <w:t xml:space="preserve"> or </w:t>
-      </w:r>
-      <w:proofErr w:type="spellStart"/>
-      <w:r>
-        <w:rPr>
-          <w:i/>
-          <w:iCs/>
-          <w:lang w:val="en-US"/>
-        </w:rPr>
-        <w:t>youtube</w:t>
-      </w:r>
-      <w:proofErr w:type="spellEnd"/>
-      <w:r>
-        <w:rPr>
-          <w:i/>
-          <w:iCs/>
-          <w:lang w:val="en-US"/>
-        </w:rPr>
-        <w:t>-dl</w:t>
-      </w:r>
-      <w:r>
-        <w:rPr>
-          <w:lang w:val="en-US"/>
-        </w:rPr>
-        <w:t xml:space="preserve"> are no longer maintained</w:t>
-      </w:r>
-      <w:r>
-        <w:rPr>
-          <w:lang w:val="en-US"/>
-        </w:rPr>
-        <w:t>.</w:t>
-      </w:r>
-      <w:r>
+        <w:pStyle w:val="ListParagraph"/>
+        <w:numPr>
+          <w:ilvl w:val="0"/>
+          <w:numId w:val="3"/>
+        </w:numPr>
         <w:rPr>
           <w:b/>
           <w:bCs/>
           <w:lang w:val="en-US"/>
         </w:rPr>
-        <w:t xml:space="preserve"> </w:t>
-      </w:r>
+      </w:pPr>
       <w:r>
         <w:rPr>
           <w:b/>
           <w:bCs/>
           <w:lang w:val="en-US"/>
         </w:rPr>
-        <w:t>Run the following command to install the library.</w:t>
+        <w:t xml:space="preserve">Installing </w:t>
+      </w:r>
+      <w:proofErr w:type="spellStart"/>
+      <w:r>
+        <w:rPr>
+          <w:b/>
+          <w:bCs/>
+          <w:lang w:val="en-US"/>
+        </w:rPr>
+        <w:t>yt-dlp</w:t>
+      </w:r>
+      <w:proofErr w:type="spellEnd"/>
+      <w:r>
+        <w:rPr>
+          <w:b/>
+          <w:bCs/>
+          <w:lang w:val="en-US"/>
+        </w:rPr>
+        <w:t xml:space="preserve"> package.</w:t>
       </w:r>
     </w:p>
     <w:p>
       <w:pPr>
-        <w:ind w:left="1440" w:firstLine="720"/>
-        <w:rPr>
-          <w:i/>
-          <w:iCs/>
-          <w:lang w:val="en-US"/>
-        </w:rPr>
-      </w:pPr>
-      <w:r>
-        <w:rPr>
-          <w:i/>
-          <w:iCs/>
-          <w:lang w:val="en-US"/>
-        </w:rPr>
-        <w:t xml:space="preserve">pip install </w:t>
+        <w:pStyle w:val="ListParagraph"/>
+        <w:rPr>
+          <w:lang w:val="en-US"/>
+        </w:rPr>
+      </w:pPr>
+      <w:r>
+        <w:rPr>
+          <w:lang w:val="en-US"/>
+        </w:rPr>
+        <w:t xml:space="preserve">For this script to run you need to install the </w:t>
       </w:r>
       <w:proofErr w:type="spellStart"/>
       <w:r>
         <w:rPr>
           <w:i/>
           <w:iCs/>
+          <w:u w:val="single"/>
           <w:lang w:val="en-US"/>
         </w:rPr>
         <w:t>yt-dlp</w:t>
@@ -188,61 +125,175 @@
           <w:lang w:val="en-US"/>
         </w:rPr>
         <w:t xml:space="preserve"> </w:t>
+      </w:r>
+      <w:r>
+        <w:rPr>
+          <w:lang w:val="en-US"/>
+        </w:rPr>
+        <w:t xml:space="preserve">library since libraries like </w:t>
+      </w:r>
+      <w:proofErr w:type="spellStart"/>
+      <w:proofErr w:type="gramStart"/>
+      <w:r>
+        <w:rPr>
+          <w:i/>
+          <w:iCs/>
+          <w:lang w:val="en-US"/>
+        </w:rPr>
+        <w:t>pytube</w:t>
+      </w:r>
+      <w:proofErr w:type="spellEnd"/>
+      <w:proofErr w:type="gramEnd"/>
+      <w:r>
+        <w:rPr>
+          <w:lang w:val="en-US"/>
+        </w:rPr>
+        <w:t xml:space="preserve"> or </w:t>
+      </w:r>
+      <w:proofErr w:type="spellStart"/>
+      <w:r>
+        <w:rPr>
+          <w:i/>
+          <w:iCs/>
+          <w:lang w:val="en-US"/>
+        </w:rPr>
+        <w:t>youtube</w:t>
+      </w:r>
+      <w:proofErr w:type="spellEnd"/>
+      <w:r>
+        <w:rPr>
+          <w:i/>
+          <w:iCs/>
+          <w:lang w:val="en-US"/>
+        </w:rPr>
+        <w:t>-dl</w:t>
+      </w:r>
+      <w:r>
+        <w:rPr>
+          <w:lang w:val="en-US"/>
+        </w:rPr>
+        <w:t xml:space="preserve"> are no longer maintained.</w:t>
+      </w:r>
+      <w:r>
+        <w:rPr>
+          <w:b/>
+          <w:bCs/>
+          <w:lang w:val="en-US"/>
+        </w:rPr>
+        <w:t xml:space="preserve"> Run the following command to install the library.</w:t>
       </w:r>
     </w:p>
     <w:p>
       <w:pPr>
-        <w:rPr>
-          <w:i/>
-          <w:iCs/>
-          <w:lang w:val="en-US"/>
-        </w:rPr>
-      </w:pPr>
+        <w:pStyle w:val="ListParagraph"/>
+        <w:ind w:left="2880" w:firstLine="720"/>
+        <w:rPr>
+          <w:i/>
+          <w:iCs/>
+          <w:u w:val="single"/>
+          <w:lang w:val="en-US"/>
+        </w:rPr>
+      </w:pPr>
+      <w:r>
+        <w:rPr>
+          <w:i/>
+          <w:iCs/>
+          <w:u w:val="single"/>
+          <w:lang w:val="en-US"/>
+        </w:rPr>
+        <w:t xml:space="preserve">pip install </w:t>
+      </w:r>
+      <w:proofErr w:type="spellStart"/>
+      <w:r>
+        <w:rPr>
+          <w:i/>
+          <w:iCs/>
+          <w:u w:val="single"/>
+          <w:lang w:val="en-US"/>
+        </w:rPr>
+        <w:t>yt-dlp</w:t>
+      </w:r>
+      <w:proofErr w:type="spellEnd"/>
+      <w:r>
+        <w:rPr>
+          <w:i/>
+          <w:iCs/>
+          <w:u w:val="single"/>
+          <w:lang w:val="en-US"/>
+        </w:rPr>
+        <w:t xml:space="preserve"> </w:t>
+      </w:r>
     </w:p>
     <w:p>
       <w:pPr>
-        <w:rPr>
-          <w:lang w:val="en-US"/>
-        </w:rPr>
-      </w:pPr>
-      <w:r>
-        <w:rPr>
-          <w:lang w:val="en-US"/>
-        </w:rPr>
-        <w:t xml:space="preserve">If the </w:t>
-      </w:r>
-      <w:r>
-        <w:rPr>
-          <w:i/>
-          <w:iCs/>
-          <w:u w:val="single"/>
-          <w:lang w:val="en-US"/>
-        </w:rPr>
-        <w:t>pip</w:t>
-      </w:r>
-      <w:r>
-        <w:rPr>
-          <w:lang w:val="en-US"/>
-        </w:rPr>
-        <w:t xml:space="preserve"> command is not recognized by your terminal, then run the command below and follow the instruction (</w:t>
-      </w:r>
-      <w:r>
-        <w:rPr>
-          <w:i/>
-          <w:iCs/>
-          <w:lang w:val="en-US"/>
-        </w:rPr>
-        <w:t>you might need to agree to some terms and conditions</w:t>
-      </w:r>
-      <w:r>
-        <w:rPr>
-          <w:lang w:val="en-US"/>
-        </w:rPr>
-        <w:t>).</w:t>
-      </w:r>
+        <w:pStyle w:val="ListParagraph"/>
+        <w:rPr>
+          <w:i/>
+          <w:iCs/>
+          <w:lang w:val="en-US"/>
+        </w:rPr>
+      </w:pPr>
     </w:p>
     <w:p>
       <w:pPr>
+        <w:pStyle w:val="ListParagraph"/>
+        <w:rPr>
+          <w:lang w:val="en-US"/>
+        </w:rPr>
+      </w:pPr>
+      <w:r>
+        <w:rPr>
+          <w:lang w:val="en-US"/>
+        </w:rPr>
+        <w:t xml:space="preserve">If the </w:t>
+      </w:r>
+      <w:r>
+        <w:rPr>
+          <w:i/>
+          <w:iCs/>
+          <w:u w:val="single"/>
+          <w:lang w:val="en-US"/>
+        </w:rPr>
+        <w:t>pip</w:t>
+      </w:r>
+      <w:r>
+        <w:rPr>
+          <w:lang w:val="en-US"/>
+        </w:rPr>
+        <w:t xml:space="preserve"> command is not recognized by your terminal, then run the command below and follow the </w:t>
+      </w:r>
+      <w:proofErr w:type="gramStart"/>
+      <w:r>
+        <w:rPr>
+          <w:lang w:val="en-US"/>
+        </w:rPr>
+        <w:t>instruction</w:t>
+      </w:r>
+      <w:proofErr w:type="gramEnd"/>
+      <w:r>
+        <w:rPr>
+          <w:lang w:val="en-US"/>
+        </w:rPr>
+        <w:t xml:space="preserve"> (</w:t>
+      </w:r>
+      <w:r>
+        <w:rPr>
+          <w:i/>
+          <w:iCs/>
+          <w:lang w:val="en-US"/>
+        </w:rPr>
+        <w:t>you might need to agree to some terms and conditions</w:t>
+      </w:r>
+      <w:r>
+        <w:rPr>
+          <w:lang w:val="en-US"/>
+        </w:rPr>
+        <w:t>).</w:t>
+      </w:r>
+    </w:p>
+    <w:p>
+      <w:pPr>
+        <w:pStyle w:val="ListParagraph"/>
         <w:rPr>
           <w:i/>
           <w:iCs/>
@@ -298,16 +349,7 @@
           <w:iCs/>
           <w:u w:val="single"/>
         </w:rPr>
-        <w:t>yt-</w:t>
-      </w:r>
-      <w:proofErr w:type="gramStart"/>
-      <w:r>
-        <w:rPr>
-          <w:i/>
-          <w:iCs/>
-          <w:u w:val="single"/>
-        </w:rPr>
-        <w:t>dlp</w:t>
+        <w:t>yt-dlp</w:t>
       </w:r>
       <w:proofErr w:type="spellEnd"/>
       <w:r>
@@ -318,11 +360,7 @@
         <w:t xml:space="preserve"> </w:t>
       </w:r>
       <w:r>
-        <w:t xml:space="preserve"> or</w:t>
-      </w:r>
-      <w:proofErr w:type="gramEnd"/>
-      <w:r>
-        <w:t xml:space="preserve"> </w:t>
+        <w:t xml:space="preserve"> or </w:t>
       </w:r>
       <w:proofErr w:type="spellStart"/>
       <w:r>
@@ -355,22 +393,172 @@
     </w:p>
     <w:p>
       <w:pPr>
+        <w:pStyle w:val="ListParagraph"/>
+      </w:pPr>
+      <w:r>
         <w:rPr>
           <w:b/>
           <w:bCs/>
-          <w:lang w:val="en-US"/>
-        </w:rPr>
-      </w:pPr>
-      <w:r>
+        </w:rPr>
+        <w:t xml:space="preserve">NB. </w:t>
+      </w:r>
+      <w:r>
+        <w:t>This works for windows OS. Check the appropriate commands if using any other OS.</w:t>
+      </w:r>
+    </w:p>
+    <w:p>
+      <w:pPr>
+        <w:pStyle w:val="ListParagraph"/>
+      </w:pPr>
+      <w:r>
+        <w:t>Alternatively, one can use the Python Launcher. Windows usually registers</w:t>
+      </w:r>
+      <w:r>
+        <w:rPr>
+          <w:i/>
+          <w:iCs/>
+        </w:rPr>
+        <w:t xml:space="preserve"> </w:t>
+      </w:r>
+      <w:proofErr w:type="spellStart"/>
+      <w:r>
+        <w:rPr>
+          <w:i/>
+          <w:iCs/>
+        </w:rPr>
+        <w:t>py</w:t>
+      </w:r>
+      <w:proofErr w:type="spellEnd"/>
+      <w:r>
+        <w:t xml:space="preserve">  globally thus you can run instead install </w:t>
+      </w:r>
+      <w:proofErr w:type="spellStart"/>
+      <w:r>
+        <w:t>yt-dlp</w:t>
+      </w:r>
+      <w:proofErr w:type="spellEnd"/>
+      <w:r>
+        <w:t xml:space="preserve"> by running  the following command. </w:t>
+      </w:r>
+    </w:p>
+    <w:p>
+      <w:pPr>
+        <w:pStyle w:val="ListParagraph"/>
+        <w:rPr>
+          <w:i/>
+          <w:iCs/>
+          <w:u w:val="single"/>
+        </w:rPr>
+      </w:pPr>
+      <w:r>
+        <w:tab/>
+      </w:r>
+      <w:r>
+        <w:tab/>
+      </w:r>
+      <w:r>
+        <w:tab/>
+      </w:r>
+      <w:r>
+        <w:tab/>
+      </w:r>
+      <w:proofErr w:type="spellStart"/>
+      <w:r>
+        <w:rPr>
+          <w:i/>
+          <w:iCs/>
+          <w:u w:val="single"/>
+        </w:rPr>
+        <w:t>py</w:t>
+      </w:r>
+      <w:proofErr w:type="spellEnd"/>
+      <w:r>
+        <w:rPr>
+          <w:i/>
+          <w:iCs/>
+          <w:u w:val="single"/>
+        </w:rPr>
+        <w:t xml:space="preserve"> -m pip install </w:t>
+      </w:r>
+      <w:proofErr w:type="spellStart"/>
+      <w:r>
+        <w:rPr>
+          <w:i/>
+          <w:iCs/>
+          <w:u w:val="single"/>
+        </w:rPr>
+        <w:t>yt-dlp</w:t>
+      </w:r>
+      <w:proofErr w:type="spellEnd"/>
+    </w:p>
+    <w:p>
+      <w:pPr>
+        <w:pStyle w:val="ListParagraph"/>
+        <w:rPr>
+          <w:i/>
+          <w:iCs/>
+          <w:u w:val="single"/>
+        </w:rPr>
+      </w:pPr>
+    </w:p>
+    <w:p>
+      <w:pPr>
+        <w:pStyle w:val="ListParagraph"/>
+        <w:numPr>
+          <w:ilvl w:val="0"/>
+          <w:numId w:val="3"/>
+        </w:numPr>
         <w:rPr>
           <w:b/>
           <w:bCs/>
-        </w:rPr>
-        <w:t xml:space="preserve">NB. </w:t>
-      </w:r>
-      <w:r>
-        <w:t>This works for windows OS. Check the appropriate commands if using any other OS.</w:t>
-      </w:r>
+          <w:i/>
+          <w:iCs/>
+          <w:u w:val="single"/>
+        </w:rPr>
+      </w:pPr>
+      <w:r>
+        <w:rPr>
+          <w:b/>
+          <w:bCs/>
+        </w:rPr>
+        <w:t xml:space="preserve">Installing </w:t>
+      </w:r>
+      <w:proofErr w:type="spellStart"/>
+      <w:r>
+        <w:rPr>
+          <w:b/>
+          <w:bCs/>
+        </w:rPr>
+        <w:t>FFmpeg</w:t>
+      </w:r>
+      <w:proofErr w:type="spellEnd"/>
+      <w:r>
+        <w:rPr>
+          <w:b/>
+          <w:bCs/>
+        </w:rPr>
+        <w:t xml:space="preserve"> package</w:t>
+      </w:r>
+    </w:p>
+    <w:p>
+      <w:pPr>
+        <w:pStyle w:val="ListParagraph"/>
+        <w:rPr>
+          <w:i/>
+          <w:iCs/>
+          <w:u w:val="single"/>
+        </w:rPr>
+      </w:pPr>
+    </w:p>
+    <w:p>
+      <w:pPr>
+        <w:pStyle w:val="ListParagraph"/>
+        <w:rPr>
+          <w:b/>
+          <w:bCs/>
+          <w:lang w:val="en-US"/>
+        </w:rPr>
+      </w:pPr>
     </w:p>
     <w:sectPr>
       <w:pgSz w:w="11906" w:h="16838"/>
@@ -382,8 +570,289 @@
 </w:document>
 </file>
 
+<file path=word/numbering.xml><?xml version="1.0" encoding="utf-8"?>
+<w:numbering xmlns:wpc="http://schemas.microsoft.com/office/word/2010/wordprocessingCanvas" xmlns:cx="http://schemas.microsoft.com/office/drawing/2014/chartex" xmlns:cx1="http://schemas.microsoft.com/office/drawing/2015/9/8/chartex" xmlns:cx2="http://schemas.microsoft.com/office/drawing/2015/10/21/chartex" xmlns:cx3="http://schemas.microsoft.com/office/drawing/2016/5/9/chartex" xmlns:cx4="http://schemas.microsoft.com/office/drawing/2016/5/10/chartex" xmlns:cx5="http://schemas.microsoft.com/office/drawing/2016/5/11/chartex" xmlns:cx6="http://schemas.microsoft.com/office/drawing/2016/5/12/chartex" xmlns:cx7="http://schemas.microsoft.com/office/drawing/2016/5/13/chartex" xmlns:cx8="http://schemas.microsoft.com/office/drawing/2016/5/14/chartex" xmlns:mc="http://schemas.openxmlformats.org/markup-compatibility/2006" xmlns:aink="http://schemas.microsoft.com/office/drawing/2016/ink" xmlns:am3d="http://schemas.microsoft.com/office/drawing/2017/model3d" xmlns:o="urn:schemas-microsoft-com:office:office" xmlns:oel="http://schemas.microsoft.com/office/2019/extlst" xmlns:r="http://schemas.openxmlformats.org/officeDocument/2006/relationships" xmlns:m="http://schemas.openxmlformats.org/officeDocument/2006/math" xmlns:v="urn:schemas-microsoft-com:vml" xmlns:wp14="http://schemas.microsoft.com/office/word/2010/wordprocessingDrawing" xmlns:wp="http://schemas.openxmlformats.org/drawingml/2006/wordprocessingDrawing" xmlns:w10="urn:schemas-microsoft-com:office:word" xmlns:w="http://schemas.openxmlformats.org/wordprocessingml/2006/main" xmlns:w14="http://schemas.microsoft.com/office/word/2010/wordml" xmlns:w15="http://schemas.microsoft.com/office/word/2012/wordml" xmlns:w16cex="http://schemas.microsoft.com/office/word/2018/wordml/cex" xmlns:w16cid="http://schemas.microsoft.com/office/word/2016/wordml/cid" xmlns:w16="http://schemas.microsoft.com/office/word/2018/wordml" xmlns:w16du="http://schemas.microsoft.com/office/word/2023/wordml/word16du" xmlns:w16sdtdh="http://schemas.microsoft.com/office/word/2020/wordml/sdtdatahash" xmlns:w16sdtfl="http://schemas.microsoft.com/office/word/2024/wordml/sdtformatlock" xmlns:w16se="http://schemas.microsoft.com/office/word/2015/wordml/symex" xmlns:wpg="http://schemas.microsoft.com/office/word/2010/wordprocessingGroup" xmlns:wpi="http://schemas.microsoft.com/office/word/2010/wordprocessingInk" xmlns:wne="http://schemas.microsoft.com/office/word/2006/wordml" xmlns:wps="http://schemas.microsoft.com/office/word/2010/wordprocessingShape" mc:Ignorable="w14 w15 w16se w16cid w16 w16cex w16sdtdh w16sdtfl w16du wp14">
+  <w:abstractNum w:abstractNumId="0" w15:restartNumberingAfterBreak="0">
+    <w:nsid w:val="15AD4675"/>
+    <w:multiLevelType w:val="hybridMultilevel"/>
+    <w:tmpl w:val="4F1EB4B8"/>
+    <w:lvl w:ilvl="0" w:tplc="0409000F">
+      <w:start w:val="1"/>
+      <w:numFmt w:val="decimal"/>
+      <w:lvlText w:val="%1."/>
+      <w:lvlJc w:val="left"/>
+      <w:pPr>
+        <w:ind w:left="720" w:hanging="360"/>
+      </w:pPr>
+      <w:rPr>
+        <w:rFonts w:hint="default"/>
+      </w:rPr>
+    </w:lvl>
+    <w:lvl w:ilvl="1" w:tplc="04090019" w:tentative="1">
+      <w:start w:val="1"/>
+      <w:numFmt w:val="lowerLetter"/>
+      <w:lvlText w:val="%2."/>
+      <w:lvlJc w:val="left"/>
+      <w:pPr>
+        <w:ind w:left="1440" w:hanging="360"/>
+      </w:pPr>
+    </w:lvl>
+    <w:lvl w:ilvl="2" w:tplc="0409001B" w:tentative="1">
+      <w:start w:val="1"/>
+      <w:numFmt w:val="lowerRoman"/>
+      <w:lvlText w:val="%3."/>
+      <w:lvlJc w:val="right"/>
+      <w:pPr>
+        <w:ind w:left="2160" w:hanging="180"/>
+      </w:pPr>
+    </w:lvl>
+    <w:lvl w:ilvl="3" w:tplc="0409000F" w:tentative="1">
+      <w:start w:val="1"/>
+      <w:numFmt w:val="decimal"/>
+      <w:lvlText w:val="%4."/>
+      <w:lvlJc w:val="left"/>
+      <w:pPr>
+        <w:ind w:left="2880" w:hanging="360"/>
+      </w:pPr>
+    </w:lvl>
+    <w:lvl w:ilvl="4" w:tplc="04090019" w:tentative="1">
+      <w:start w:val="1"/>
+      <w:numFmt w:val="lowerLetter"/>
+      <w:lvlText w:val="%5."/>
+      <w:lvlJc w:val="left"/>
+      <w:pPr>
+        <w:ind w:left="3600" w:hanging="360"/>
+      </w:pPr>
+    </w:lvl>
+    <w:lvl w:ilvl="5" w:tplc="0409001B" w:tentative="1">
+      <w:start w:val="1"/>
+      <w:numFmt w:val="lowerRoman"/>
+      <w:lvlText w:val="%6."/>
+      <w:lvlJc w:val="right"/>
+      <w:pPr>
+        <w:ind w:left="4320" w:hanging="180"/>
+      </w:pPr>
+    </w:lvl>
+    <w:lvl w:ilvl="6" w:tplc="0409000F" w:tentative="1">
+      <w:start w:val="1"/>
+      <w:numFmt w:val="decimal"/>
+      <w:lvlText w:val="%7."/>
+      <w:lvlJc w:val="left"/>
+      <w:pPr>
+        <w:ind w:left="5040" w:hanging="360"/>
+      </w:pPr>
+    </w:lvl>
+    <w:lvl w:ilvl="7" w:tplc="04090019" w:tentative="1">
+      <w:start w:val="1"/>
+      <w:numFmt w:val="lowerLetter"/>
+      <w:lvlText w:val="%8."/>
+      <w:lvlJc w:val="left"/>
+      <w:pPr>
+        <w:ind w:left="5760" w:hanging="360"/>
+      </w:pPr>
+    </w:lvl>
+    <w:lvl w:ilvl="8" w:tplc="0409001B" w:tentative="1">
+      <w:start w:val="1"/>
+      <w:numFmt w:val="lowerRoman"/>
+      <w:lvlText w:val="%9."/>
+      <w:lvlJc w:val="right"/>
+      <w:pPr>
+        <w:ind w:left="6480" w:hanging="180"/>
+      </w:pPr>
+    </w:lvl>
+  </w:abstractNum>
+  <w:abstractNum w:abstractNumId="1" w15:restartNumberingAfterBreak="0">
+    <w:nsid w:val="55473A5E"/>
+    <w:multiLevelType w:val="hybridMultilevel"/>
+    <w:tmpl w:val="B3B0FBA8"/>
+    <w:lvl w:ilvl="0" w:tplc="0409000F">
+      <w:start w:val="1"/>
+      <w:numFmt w:val="decimal"/>
+      <w:lvlText w:val="%1."/>
+      <w:lvlJc w:val="left"/>
+      <w:pPr>
+        <w:ind w:left="720" w:hanging="360"/>
+      </w:pPr>
+      <w:rPr>
+        <w:rFonts w:hint="default"/>
+      </w:rPr>
+    </w:lvl>
+    <w:lvl w:ilvl="1" w:tplc="04090019" w:tentative="1">
+      <w:start w:val="1"/>
+      <w:numFmt w:val="lowerLetter"/>
+      <w:lvlText w:val="%2."/>
+      <w:lvlJc w:val="left"/>
+      <w:pPr>
+        <w:ind w:left="1440" w:hanging="360"/>
+      </w:pPr>
+    </w:lvl>
+    <w:lvl w:ilvl="2" w:tplc="0409001B" w:tentative="1">
+      <w:start w:val="1"/>
+      <w:numFmt w:val="lowerRoman"/>
+      <w:lvlText w:val="%3."/>
+      <w:lvlJc w:val="right"/>
+      <w:pPr>
+        <w:ind w:left="2160" w:hanging="180"/>
+      </w:pPr>
+    </w:lvl>
+    <w:lvl w:ilvl="3" w:tplc="0409000F" w:tentative="1">
+      <w:start w:val="1"/>
+      <w:numFmt w:val="decimal"/>
+      <w:lvlText w:val="%4."/>
+      <w:lvlJc w:val="left"/>
+      <w:pPr>
+        <w:ind w:left="2880" w:hanging="360"/>
+      </w:pPr>
+    </w:lvl>
+    <w:lvl w:ilvl="4" w:tplc="04090019" w:tentative="1">
+      <w:start w:val="1"/>
+      <w:numFmt w:val="lowerLetter"/>
+      <w:lvlText w:val="%5."/>
+      <w:lvlJc w:val="left"/>
+      <w:pPr>
+        <w:ind w:left="3600" w:hanging="360"/>
+      </w:pPr>
+    </w:lvl>
+    <w:lvl w:ilvl="5" w:tplc="0409001B" w:tentative="1">
+      <w:start w:val="1"/>
+      <w:numFmt w:val="lowerRoman"/>
+      <w:lvlText w:val="%6."/>
+      <w:lvlJc w:val="right"/>
+      <w:pPr>
+        <w:ind w:left="4320" w:hanging="180"/>
+      </w:pPr>
+    </w:lvl>
+    <w:lvl w:ilvl="6" w:tplc="0409000F" w:tentative="1">
+      <w:start w:val="1"/>
+      <w:numFmt w:val="decimal"/>
+      <w:lvlText w:val="%7."/>
+      <w:lvlJc w:val="left"/>
+      <w:pPr>
+        <w:ind w:left="5040" w:hanging="360"/>
+      </w:pPr>
+    </w:lvl>
+    <w:lvl w:ilvl="7" w:tplc="04090019" w:tentative="1">
+      <w:start w:val="1"/>
+      <w:numFmt w:val="lowerLetter"/>
+      <w:lvlText w:val="%8."/>
+      <w:lvlJc w:val="left"/>
+      <w:pPr>
+        <w:ind w:left="5760" w:hanging="360"/>
+      </w:pPr>
+    </w:lvl>
+    <w:lvl w:ilvl="8" w:tplc="0409001B" w:tentative="1">
+      <w:start w:val="1"/>
+      <w:numFmt w:val="lowerRoman"/>
+      <w:lvlText w:val="%9."/>
+      <w:lvlJc w:val="right"/>
+      <w:pPr>
+        <w:ind w:left="6480" w:hanging="180"/>
+      </w:pPr>
+    </w:lvl>
+  </w:abstractNum>
+  <w:abstractNum w:abstractNumId="2" w15:restartNumberingAfterBreak="0">
+    <w:nsid w:val="649B65E9"/>
+    <w:multiLevelType w:val="hybridMultilevel"/>
+    <w:tmpl w:val="17EE85D8"/>
+    <w:lvl w:ilvl="0" w:tplc="0409000F">
+      <w:start w:val="1"/>
+      <w:numFmt w:val="decimal"/>
+      <w:lvlText w:val="%1."/>
+      <w:lvlJc w:val="left"/>
+      <w:pPr>
+        <w:ind w:left="720" w:hanging="360"/>
+      </w:pPr>
+      <w:rPr>
+        <w:rFonts w:hint="default"/>
+      </w:rPr>
+    </w:lvl>
+    <w:lvl w:ilvl="1" w:tplc="04090019" w:tentative="1">
+      <w:start w:val="1"/>
+      <w:numFmt w:val="lowerLetter"/>
+      <w:lvlText w:val="%2."/>
+      <w:lvlJc w:val="left"/>
+      <w:pPr>
+        <w:ind w:left="1440" w:hanging="360"/>
+      </w:pPr>
+    </w:lvl>
+    <w:lvl w:ilvl="2" w:tplc="0409001B" w:tentative="1">
+      <w:start w:val="1"/>
+      <w:numFmt w:val="lowerRoman"/>
+      <w:lvlText w:val="%3."/>
+      <w:lvlJc w:val="right"/>
+      <w:pPr>
+        <w:ind w:left="2160" w:hanging="180"/>
+      </w:pPr>
+    </w:lvl>
+    <w:lvl w:ilvl="3" w:tplc="0409000F" w:tentative="1">
+      <w:start w:val="1"/>
+      <w:numFmt w:val="decimal"/>
+      <w:lvlText w:val="%4."/>
+      <w:lvlJc w:val="left"/>
+      <w:pPr>
+        <w:ind w:left="2880" w:hanging="360"/>
+      </w:pPr>
+    </w:lvl>
+    <w:lvl w:ilvl="4" w:tplc="04090019" w:tentative="1">
+      <w:start w:val="1"/>
+      <w:numFmt w:val="lowerLetter"/>
+      <w:lvlText w:val="%5."/>
+      <w:lvlJc w:val="left"/>
+      <w:pPr>
+        <w:ind w:left="3600" w:hanging="360"/>
+      </w:pPr>
+    </w:lvl>
+    <w:lvl w:ilvl="5" w:tplc="0409001B" w:tentative="1">
+      <w:start w:val="1"/>
+      <w:numFmt w:val="lowerRoman"/>
+      <w:lvlText w:val="%6."/>
+      <w:lvlJc w:val="right"/>
+      <w:pPr>
+        <w:ind w:left="4320" w:hanging="180"/>
+      </w:pPr>
+    </w:lvl>
+    <w:lvl w:ilvl="6" w:tplc="0409000F" w:tentative="1">
+      <w:start w:val="1"/>
+      <w:numFmt w:val="decimal"/>
+      <w:lvlText w:val="%7."/>
+      <w:lvlJc w:val="left"/>
+      <w:pPr>
+        <w:ind w:left="5040" w:hanging="360"/>
+      </w:pPr>
+    </w:lvl>
+    <w:lvl w:ilvl="7" w:tplc="04090019" w:tentative="1">
+      <w:start w:val="1"/>
+      <w:numFmt w:val="lowerLetter"/>
+      <w:lvlText w:val="%8."/>
+      <w:lvlJc w:val="left"/>
+      <w:pPr>
+        <w:ind w:left="5760" w:hanging="360"/>
+      </w:pPr>
+    </w:lvl>
+    <w:lvl w:ilvl="8" w:tplc="0409001B" w:tentative="1">
+      <w:start w:val="1"/>
+      <w:numFmt w:val="lowerRoman"/>
+      <w:lvlText w:val="%9."/>
+      <w:lvlJc w:val="right"/>
+      <w:pPr>
+        <w:ind w:left="6480" w:hanging="180"/>
+      </w:pPr>
+    </w:lvl>
+  </w:abstractNum>
+  <w:num w:numId="1" w16cid:durableId="1095129263">
+    <w:abstractNumId w:val="2"/>
+  </w:num>
+  <w:num w:numId="2" w16cid:durableId="1393655164">
+    <w:abstractNumId w:val="1"/>
+  </w:num>
+  <w:num w:numId="3" w16cid:durableId="1535382676">
+    <w:abstractNumId w:val="0"/>
+  </w:num>
+</w:numbering>
+</file>
+
 <file path=word/styles.xml><?xml version="1.0" encoding="utf-8"?>
-<w:styles xmlns:mc="http://schemas.openxmlformats.org/markup-compatibility/2006" xmlns:r="http://schemas.openxmlformats.org/officeDocument/2006/relationships" xmlns:w="http://schemas.openxmlformats.org/wordprocessingml/2006/main" xmlns:w14="http://schemas.microsoft.com/office/word/2010/wordml" xmlns:w15="http://schemas.microsoft.com/office/word/2012/wordml" xmlns:w16cex="http://schemas.microsoft.com/office/word/2018/wordml/cex" xmlns:w16cid="http://schemas.microsoft.com/office/word/2016/wordml/cid" xmlns:w16="http://schemas.microsoft.com/office/word/2018/wordml" xmlns:w16sdtdh="http://schemas.microsoft.com/office/word/2020/wordml/sdtdatahash" xmlns:w16se="http://schemas.microsoft.com/office/word/2015/wordml/symex" mc:Ignorable="w14 w15 w16se w16cid w16 w16cex w16sdtdh">
+<w:styles xmlns:mc="http://schemas.openxmlformats.org/markup-compatibility/2006" xmlns:r="http://schemas.openxmlformats.org/officeDocument/2006/relationships" xmlns:w="http://schemas.openxmlformats.org/wordprocessingml/2006/main" xmlns:w14="http://schemas.microsoft.com/office/word/2010/wordml" xmlns:w15="http://schemas.microsoft.com/office/word/2012/wordml" xmlns:w16cex="http://schemas.microsoft.com/office/word/2018/wordml/cex" xmlns:w16cid="http://schemas.microsoft.com/office/word/2016/wordml/cid" xmlns:w16="http://schemas.microsoft.com/office/word/2018/wordml" xmlns:w16du="http://schemas.microsoft.com/office/word/2023/wordml/word16du" xmlns:w16sdtdh="http://schemas.microsoft.com/office/word/2020/wordml/sdtdatahash" xmlns:w16sdtfl="http://schemas.microsoft.com/office/word/2024/wordml/sdtformatlock" xmlns:w16se="http://schemas.microsoft.com/office/word/2015/wordml/symex" mc:Ignorable="w14 w15 w16se w16cid w16 w16cex w16sdtdh w16sdtfl w16du">
   <w:docDefaults>
     <w:rPrDefault>
       <w:rPr>

</xml_diff>